<commit_message>
Update project-wide files: README, docs, final assignment, gitignore
Rewrite README with repo structure tables and naming conventions,
update lectures outline, add suggested books notebook/PDF to docs,
expand final assignment FAQ, add 2025 data selection guidelines,
add grading/feedback templates, remove obsolete files, and update
gitignore with .vscode, data, real_world_examples, to_read entries.
</commit_message>
<xml_diff>
--- a/final_assignment/final_assignment_python_2024.docx
+++ b/final_assignment/final_assignment_python_2024.docx
@@ -25,7 +25,7 @@
       </w:r>
       <w:r>
         <w:rPr/>
-        <w:t>4</w:t>
+        <w:t>5</w:t>
       </w:r>
     </w:p>
     <w:p>
@@ -67,41 +67,66 @@
       </w:pPr>
       <w:r>
         <w:rPr/>
-        <w:t>Θ</w:t>
-      </w:r>
-      <w:r>
-        <w:rPr/>
-        <w:t>α επιλέξετε τουλάχιστον δύο διαφορετικά (ή τρία αν προτιμάτε) σύνολα δεδομένων και θα εφαρμόσετε όλους τους αλγόριθμους που παρουσιάστηκαν στις διαλέξεις του μαθήματος. Οι αλγόριθμοι διακρίνονται σε τρεις μεγάλες κατηγορίες: Παλινδρόμηση (</w:t>
-      </w:r>
-      <w:r>
-        <w:rPr>
-          <w:lang w:val="en-US"/>
-        </w:rPr>
-        <w:t>Regression</w:t>
-      </w:r>
-      <w:r>
-        <w:rPr/>
-        <w:t xml:space="preserve">), </w:t>
-      </w:r>
-      <w:r>
-        <w:rPr>
-          <w:lang w:val="en-US"/>
-        </w:rPr>
-        <w:t>Clustering</w:t>
-      </w:r>
-      <w:r>
-        <w:rPr/>
-        <w:t xml:space="preserve"> (Συσταδοποίηση/Ομαδοποίηση), Κατηγοριοποίηση (</w:t>
-      </w:r>
-      <w:r>
-        <w:rPr>
-          <w:lang w:val="en-US"/>
-        </w:rPr>
-        <w:t>Classification</w:t>
-      </w:r>
-      <w:r>
-        <w:rPr/>
-        <w:t>). Για τους αλγόριθμους Κατηγοριοποίησης και Συσταδοποίησης μπορεί να χρησιμοποιηθεί το ίδιο ή διαφορετικό σύνολο δεδομένων.</w:t>
+        <w:t xml:space="preserve">Θα επιλέξετε τουλάχιστον δύο διαφορετικά (ή τρία αν προτιμάτε) σύνολα δεδομένων και θα εφαρμόσετε όλους τους αλγόριθμους που παρουσιάστηκαν </w:t>
+      </w:r>
+      <w:r>
+        <w:rPr/>
+        <w:t>στις</w:t>
+      </w:r>
+      <w:r>
+        <w:rPr/>
+        <w:t xml:space="preserve"> </w:t>
+      </w:r>
+      <w:r>
+        <w:rPr/>
+        <w:t>3</w:t>
+      </w:r>
+      <w:r>
+        <w:rPr/>
+        <w:t xml:space="preserve"> μεγάλες κατηγορίες </w:t>
+      </w:r>
+      <w:r>
+        <w:rPr/>
+        <w:t>μηχανικ</w:t>
+      </w:r>
+      <w:r>
+        <w:rPr>
+          <w:rFonts w:eastAsia="Calibri" w:cs="" w:cstheme="minorBidi" w:eastAsiaTheme="minorHAnsi"/>
+          <w:color w:val="auto"/>
+          <w:kern w:val="0"/>
+          <w:sz w:val="22"/>
+          <w:szCs w:val="22"/>
+          <w:lang w:val="el-GR" w:eastAsia="en-US" w:bidi="ar-SA"/>
+        </w:rPr>
+        <w:t>ής εκμάθησης</w:t>
+      </w:r>
+      <w:r>
+        <w:rPr/>
+        <w:t xml:space="preserve">: </w:t>
+      </w:r>
+      <w:r>
+        <w:rPr/>
+        <w:t>R</w:t>
+      </w:r>
+      <w:r>
+        <w:rPr>
+          <w:lang w:val="en-US"/>
+        </w:rPr>
+        <w:t>egression</w:t>
+      </w:r>
+      <w:r>
+        <w:rPr/>
+        <w:t xml:space="preserve">, </w:t>
+      </w:r>
+      <w:r>
+        <w:rPr>
+          <w:lang w:val="en-US"/>
+        </w:rPr>
+        <w:t>Clustering, Classification</w:t>
+      </w:r>
+      <w:r>
+        <w:rPr/>
+        <w:t>. Για τους αλγόριθμους Κατηγοριοποίησης και Συσταδοποίησης μπορεί να χρησιμοποιηθεί το ίδιο ή διαφορετικό σύνολο δεδομένων.</w:t>
       </w:r>
     </w:p>
     <w:p>
@@ -162,15 +187,7 @@
       </w:r>
       <w:r>
         <w:rPr/>
-        <w:t xml:space="preserve">” </w:t>
-      </w:r>
-      <w:r>
-        <w:rPr/>
-        <w:t>και τα αντίστοιχα αρχεία δεδομένων</w:t>
-      </w:r>
-      <w:r>
-        <w:rPr/>
-        <w:t xml:space="preserve">. </w:t>
+        <w:t xml:space="preserve">” και τα αντίστοιχα αρχεία δεδομένων. </w:t>
       </w:r>
     </w:p>
     <w:p>
@@ -192,64 +209,93 @@
           <w:u w:val="single"/>
           <w:lang w:val="en-US"/>
         </w:rPr>
+        <w:t xml:space="preserve">ipynb </w:t>
+      </w:r>
+      <w:r>
+        <w:rPr>
+          <w:u w:val="single"/>
+        </w:rPr>
+        <w:t xml:space="preserve">πρέπει </w:t>
+      </w:r>
+      <w:r>
+        <w:rPr>
+          <w:u w:val="single"/>
+        </w:rPr>
+        <w:t>να</w:t>
+      </w:r>
+      <w:r>
+        <w:rPr>
+          <w:u w:val="single"/>
+        </w:rPr>
+        <w:t>:</w:t>
+      </w:r>
+    </w:p>
+    <w:p>
+      <w:pPr>
+        <w:pStyle w:val="Normal"/>
+        <w:jc w:val="both"/>
+        <w:rPr/>
+      </w:pPr>
+      <w:r>
+        <w:rPr/>
+        <w:t>α) έχουν παρόμοιο όνομα. Ο τίτλος θα έχει “</w:t>
+      </w:r>
+      <w:r>
+        <w:rPr>
+          <w:lang w:val="en-US"/>
+        </w:rPr>
+        <w:t>snake</w:t>
+      </w:r>
+      <w:r>
+        <w:rPr/>
+        <w:t>_</w:t>
+      </w:r>
+      <w:r>
+        <w:rPr>
+          <w:lang w:val="en-US"/>
+        </w:rPr>
+        <w:t>case</w:t>
+      </w:r>
+      <w:r>
+        <w:rPr/>
+        <w:t xml:space="preserve">” μορφή, θα αποτελείται από παρόμοιο, αλλά διαφορετικό πρόθεμα (το επίθετο και το πρώτο γράμμα του ονόματος ενωμένο με το επίθετο) και τέλος κοινό επίθεμα με το πλήρες όνομα της κατηγορίας αλγορίθμων. Δηλ. αν </w:t>
+      </w:r>
+      <w:r>
+        <w:rPr/>
+        <w:t>ονομ</w:t>
+      </w:r>
+      <w:r>
+        <w:rPr>
+          <w:rFonts w:eastAsia="Calibri" w:cs="" w:cstheme="minorBidi" w:eastAsiaTheme="minorHAnsi"/>
+          <w:color w:val="auto"/>
+          <w:kern w:val="0"/>
+          <w:sz w:val="22"/>
+          <w:szCs w:val="22"/>
+          <w:lang w:val="el-GR" w:eastAsia="en-US" w:bidi="ar-SA"/>
+        </w:rPr>
+        <w:t xml:space="preserve">άζεστε </w:t>
+      </w:r>
+      <w:r>
+        <w:rPr/>
+        <w:t>Αργυρίου Θανάσης, θα παραδώσε</w:t>
+      </w:r>
+      <w:r>
+        <w:rPr/>
+        <w:t>τε</w:t>
+      </w:r>
+      <w:r>
+        <w:rPr/>
+        <w:t xml:space="preserve"> 3  *.</w:t>
+      </w:r>
+      <w:r>
+        <w:rPr>
+          <w:lang w:val="en-US"/>
+        </w:rPr>
         <w:t>ipynb</w:t>
       </w:r>
       <w:r>
-        <w:rPr>
-          <w:u w:val="single"/>
-        </w:rPr>
-        <w:t xml:space="preserve"> θα </w:t>
-      </w:r>
-      <w:r>
-        <w:rPr>
-          <w:u w:val="single"/>
-        </w:rPr>
-        <w:t>πρέπει:</w:t>
-      </w:r>
-    </w:p>
-    <w:p>
-      <w:pPr>
-        <w:pStyle w:val="Normal"/>
-        <w:jc w:val="both"/>
-        <w:rPr/>
-      </w:pPr>
-      <w:r>
-        <w:rPr/>
-        <w:t xml:space="preserve">α) Να έχουν παρόμοιο όνομα. </w:t>
-      </w:r>
-      <w:r>
-        <w:rPr/>
-        <w:t>Ο τίτλος κάθε αρχείου θα έχει “</w:t>
-      </w:r>
-      <w:r>
-        <w:rPr>
-          <w:lang w:val="en-US"/>
-        </w:rPr>
-        <w:t>snake</w:t>
-      </w:r>
-      <w:r>
-        <w:rPr/>
-        <w:t>_</w:t>
-      </w:r>
-      <w:r>
-        <w:rPr>
-          <w:lang w:val="en-US"/>
-        </w:rPr>
-        <w:t>case</w:t>
-      </w:r>
-      <w:r>
-        <w:rPr/>
-        <w:t>” μορφή, θα αποτελείται από παρόμοιο, αλλά διαφορετικό πρόθεμα (το επίθετο και το πρώτο γράμμα του ονόματος ενωμένο με το επίθετο) και τέλος κοινό επίθεμα με το πλήρες όνομα της κατηγορίας αλγορίθμων. Δηλαδή, αν ο φοιτητής ονομάζεται Αργυρίου Θανάσης, θα παραδώσει 3  *.</w:t>
-      </w:r>
-      <w:r>
-        <w:rPr>
-          <w:lang w:val="en-US"/>
-        </w:rPr>
-        <w:t>ipynb</w:t>
-      </w:r>
-      <w:r>
-        <w:rPr/>
-        <w:t xml:space="preserve"> αρχεία με τα εξής ονόματα (χωρίς κεφαλαία):</w:t>
+        <w:rPr/>
+        <w:t xml:space="preserve"> αρχεία:</w:t>
       </w:r>
     </w:p>
     <w:p>
@@ -311,11 +357,7 @@
       </w:pPr>
       <w:r>
         <w:rPr/>
-        <w:t xml:space="preserve">β) να </w:t>
-      </w:r>
-      <w:r>
-        <w:rPr/>
-        <w:t xml:space="preserve">είναι όλα σε ένα φάκελο και μέσα στο φάκελο αυτό </w:t>
+        <w:t xml:space="preserve">β) είναι όλα σε ένα φάκελο και μέσα στο φάκελο αυτό </w:t>
       </w:r>
       <w:r>
         <w:rPr>
@@ -351,7 +393,7 @@
           <w:b w:val="false"/>
           <w:bCs w:val="false"/>
         </w:rPr>
-        <w:t>γ) να είναι “εκτελέσιμα” σε οποιοδήποτε PC που έχει εγκατεστημένες τις απαραίτητες βιβλιοθήκες, χωρίς να χρειαστεί η παραμικρή αλλαγή στον κώδικά για το διάβασμα των αρχείων δεδομένων.</w:t>
+        <w:t>γ) είναι “εκτελέσιμα” σε οποιοδήποτε PC που έχει εγκατεστημένες τις απαραίτητες βιβλιοθήκες, χωρίς να χρειαστεί η παραμικρή αλλαγή στον κώδικά.</w:t>
       </w:r>
     </w:p>
     <w:p>
@@ -362,11 +404,7 @@
       </w:pPr>
       <w:r>
         <w:rPr/>
-        <w:t>δ) ν</w:t>
-      </w:r>
-      <w:r>
-        <w:rPr/>
-        <w:t xml:space="preserve">α έχουν παρόμοιες ενότητες και δομή. Μπορείτε αρχικά να φτιάξετε ένα «πρότυπο» αρχείο μόνο με «κελιά» με </w:t>
+        <w:t xml:space="preserve">δ) έχουν παρόμοιες ενότητες και δομή. Μπορείτε αρχικά να φτιάξετε ένα «πρότυπο» αρχείο μόνο με «κελιά» </w:t>
       </w:r>
       <w:r>
         <w:rPr>
@@ -479,7 +517,38 @@
       </w:r>
       <w:r>
         <w:rPr/>
-        <w:t>) με τη χρήση των κατάλληλων διαγραμμάτων ανάλογα με το είδος του χαρακτηριστικού (μεταβλητής). Τα σχόλια μπορεί να είναι συνοπτικά, χωρίς να αποκλείεται η δυνατότητα πιο εκτεταμένου σχολιασμού αν αυτό κρίνεται χρήσιμο για την κατανόηση των δεδομένων.</w:t>
+        <w:t xml:space="preserve">) με τη χρήση κατάλληλων διαγραμμάτων ανάλογα το είδος </w:t>
+      </w:r>
+      <w:r>
+        <w:rPr/>
+        <w:t>της</w:t>
+      </w:r>
+      <w:r>
+        <w:rPr/>
+        <w:t xml:space="preserve"> μεταβλητής. Τα σχόλια μπορεί να είναι συνοπτικά, </w:t>
+      </w:r>
+      <w:r>
+        <w:rPr/>
+        <w:t>η εκτετμ</w:t>
+      </w:r>
+      <w:r>
+        <w:rPr>
+          <w:rFonts w:eastAsia="Calibri" w:cs="" w:cstheme="minorBidi" w:eastAsiaTheme="minorHAnsi"/>
+          <w:color w:val="auto"/>
+          <w:kern w:val="0"/>
+          <w:sz w:val="22"/>
+          <w:szCs w:val="22"/>
+          <w:lang w:val="el-GR" w:eastAsia="en-US" w:bidi="ar-SA"/>
+        </w:rPr>
+        <w:t xml:space="preserve">ένα </w:t>
+      </w:r>
+      <w:r>
+        <w:rPr/>
+        <w:t xml:space="preserve">αν αυτό κρίνεται χρήσιμο για την κατανόηση </w:t>
+      </w:r>
+      <w:r>
+        <w:rPr/>
+        <w:t>τους.</w:t>
       </w:r>
     </w:p>
     <w:p>
@@ -521,7 +590,23 @@
       </w:pPr>
       <w:r>
         <w:rPr/>
-        <w:t xml:space="preserve">5) Προετοιμασία των δεδομένων, μετατροπή στον κατάλληλο τύπο όπου χρειάζεται και διάκριση των δεδομένων στο υποσύνολο «εκπαίδευσης» του αλγόριθμου και στο υποσύνολο «δοκιμής» του. Αν  το κρίνετε απαραίτητο, θα πρέπει να γίνει μετατροπή των τιμών των δεδομένων στην κατάλληλη κλίμακα, μετονομασία στηλών ή/και δημιουργία «παράγωγων» χαρακτηριστικών. </w:t>
+        <w:t xml:space="preserve">5) Προετοιμασία των δεδομένων, μετατροπή στον κατάλληλο τύπο </w:t>
+      </w:r>
+      <w:r>
+        <w:rPr/>
+        <w:t>αν</w:t>
+      </w:r>
+      <w:r>
+        <w:rPr/>
+        <w:t xml:space="preserve"> χρειάζεται και διάκριση των δεδομένων στο υποσύνολο «εκπαίδευσης» και στο υποσύνολο «δοκιμής». Αν κρίνετ</w:t>
+      </w:r>
+      <w:r>
+        <w:rPr/>
+        <w:t>αι</w:t>
+      </w:r>
+      <w:r>
+        <w:rPr/>
+        <w:t xml:space="preserve"> απαραίτητο, θα πρέπει να γίνει μετατροπή στην κατάλληλη κλίμακα, ή/και δημιουργία «παράγωγων» χαρακτηριστικών. </w:t>
       </w:r>
     </w:p>
     <w:p>
@@ -553,7 +638,7 @@
       </w:pPr>
       <w:r>
         <w:rPr/>
-        <w:t>Στην περίπτωση των αλγορίθμων Κατηγοριοποίησης, η ενότητα θα είναι χωρισμένη σε υπο-ενότητες, στις οποίες θα γίνεται εφαρμογή όλων των αλγορίθμων κατηγοριοποίησης με τη σειρά των διαλέξεων.</w:t>
+        <w:t>Στην περίπτωση των αλγορίθμων Κατηγοριοποίησης, η ενότητα θα είναι χωρισμένη σε υποενότητες, στις οποίες θα γίνεται εφαρμογή όλων των αλγορίθμων κατηγοριοποίησης με τη σειρά των διαλέξεων.</w:t>
       </w:r>
     </w:p>
     <w:p>
@@ -564,15 +649,7 @@
       </w:pPr>
       <w:r>
         <w:rPr/>
-        <w:t xml:space="preserve">Μετά τις προβλέψεις στα δεδομένα του υποσυνόλου του τεστ, ζητείται επίσης η παρουσίαση της πρόβλεψης της τιμής της μεταβλητής στόχου για 1 </w:t>
-      </w:r>
-      <w:r>
-        <w:rPr/>
-        <w:t xml:space="preserve">νέα υποθετική </w:t>
-      </w:r>
-      <w:r>
-        <w:rPr/>
-        <w:t xml:space="preserve">παρατήρηση (δηλ, να φτιάξετε μια νέα «σειρά» με τιμές για τον πίνακα </w:t>
+        <w:t xml:space="preserve">Μετά τις προβλέψεις στα δεδομένα του υποσυνόλου του τεστ, ζητείται επίσης η παρουσίαση της πρόβλεψης της τιμής της μεταβλητής στόχου για 1 νέα υποθετική παρατήρηση (δηλ, να φτιάξετε μια νέα «σειρά» με τιμές για τον πίνακα </w:t>
       </w:r>
       <w:r>
         <w:rPr>
@@ -606,7 +683,26 @@
       </w:pPr>
       <w:r>
         <w:rPr/>
-        <w:t>7) Αξιολόγηση αποτελεσματικότητας του αλγόριθμου, ως προς την ικανότητα πρόβλεψης, (όχι την ταχύτητα του αλγορίθμου). Η αξιολόγηση χρειάζεται να γίνει με την κατάλληλη μέθοδο μέτρησης ανάλογα τον αλγόριθμο. Ο σχολιασμός θα είναι συνοπτικός.</w:t>
+        <w:t xml:space="preserve">7) Αξιολόγηση αποτελεσματικότητας του αλγόριθμου, ως προς την ικανότητα πρόβλεψης, (όχι την ταχύτητα του αλγορίθμου). Η αξιολόγηση να γίνει με την κατάλληλη μέθοδο “μέτρησης” ανάλογα </w:t>
+      </w:r>
+      <w:r>
+        <w:rPr/>
+        <w:t>τα δεδομ</w:t>
+      </w:r>
+      <w:r>
+        <w:rPr>
+          <w:rFonts w:eastAsia="Calibri" w:cs="" w:cstheme="minorBidi" w:eastAsiaTheme="minorHAnsi"/>
+          <w:color w:val="auto"/>
+          <w:kern w:val="0"/>
+          <w:sz w:val="22"/>
+          <w:szCs w:val="22"/>
+          <w:lang w:val="el-GR" w:eastAsia="en-US" w:bidi="ar-SA"/>
+        </w:rPr>
+        <w:t>ένα και τον αλγόριθμο</w:t>
+      </w:r>
+      <w:r>
+        <w:rPr/>
+        <w:t>. Ο σχολιασμός θα είναι συνοπτικός.</w:t>
       </w:r>
     </w:p>
     <w:p>
@@ -638,15 +734,7 @@
       </w:pPr>
       <w:r>
         <w:rPr/>
-        <w:t xml:space="preserve">Η επιλογή κατάλληλων δεδομένων είναι μέρος της εργασίας </w:t>
-      </w:r>
-      <w:r>
-        <w:rPr/>
-        <w:t>και δεν απαιτείται έγκριση από τον διδάσκοντα</w:t>
-      </w:r>
-      <w:r>
-        <w:rPr/>
-        <w:t>. Μπορείτε να διαλέξετε στους συνδέσμους:</w:t>
+        <w:t>Η επιλογή κατάλληλων δεδομένων είναι μέρος της εργασίας και δεν απαιτείται έγκριση από τον διδάσκοντα. Μπορείτε να διαλέξετε στους συνδέσμους:</w:t>
       </w:r>
     </w:p>
     <w:p>
@@ -743,11 +831,7 @@
       </w:pPr>
       <w:r>
         <w:rPr/>
-        <w:t xml:space="preserve">ή να χρησιμοποιήσετε κάποιο δικό σας σύνολο δεδομένων. </w:t>
-      </w:r>
-      <w:r>
-        <w:rPr/>
-        <w:t>Πριν διαλέξετε δεδομένα διαβάστε προσεκτικά το σχετικό αρχείο οδηγιών  “dataset_selection.md”</w:t>
+        <w:t>ή να χρησιμοποιήσετε κάποιο δικό σας σύνολο δεδομένων. Πριν διαλέξετε δεδομένα διαβάστε προσεκτικά το σχετικό αρχείο οδηγιών  “dataset_selection.md”</w:t>
       </w:r>
       <w:r>
         <w:rPr>
@@ -774,14 +858,12 @@
         <w:rPr/>
         <w:t xml:space="preserve"> ώστε να μπορείτε να επεξεργαστείτε το αρχείο για την </w:t>
       </w:r>
-      <w:hyperlink r:id="rId5">
-        <w:r>
-          <w:rPr>
-            <w:rStyle w:val="InternetLink"/>
-          </w:rPr>
-          <w:t>Υποβολή Δήλωσης</w:t>
-        </w:r>
-      </w:hyperlink>
+      <w:r>
+        <w:rPr>
+          <w:rStyle w:val="InternetLink"/>
+        </w:rPr>
+        <w:t>Υποβολή Δήλωσης</w:t>
+      </w:r>
       <w:r>
         <w:rPr/>
         <w:t xml:space="preserve"> δεδομένων. Επιλογή δεδομένων το αργότερο </w:t>
@@ -791,7 +873,27 @@
           <w:b/>
           <w:bCs/>
         </w:rPr>
-        <w:t>έως 2 Ιουνίου</w:t>
+        <w:t xml:space="preserve">έως </w:t>
+      </w:r>
+      <w:r>
+        <w:rPr>
+          <w:b/>
+          <w:bCs/>
+        </w:rPr>
+        <w:t>15 Μ</w:t>
+      </w:r>
+      <w:r>
+        <w:rPr>
+          <w:rFonts w:eastAsia="Calibri" w:cs="" w:cstheme="minorBidi" w:eastAsiaTheme="minorHAnsi"/>
+          <w:b/>
+          <w:bCs/>
+          <w:color w:val="auto"/>
+          <w:kern w:val="0"/>
+          <w:sz w:val="22"/>
+          <w:szCs w:val="22"/>
+          <w:lang w:val="el-GR" w:eastAsia="en-US" w:bidi="ar-SA"/>
+        </w:rPr>
+        <w:t>άη</w:t>
       </w:r>
       <w:r>
         <w:rPr/>
@@ -802,14 +904,14 @@
           <w:b w:val="false"/>
           <w:bCs w:val="false"/>
         </w:rPr>
-        <w:t xml:space="preserve">Θα πρότεινα να ξεκινήσετε την εργασία το συντομότερο, θα σας βοηθήσει και για </w:t>
+        <w:t xml:space="preserve">Θα πρότεινα να ξεκινήσετε την εργασία το συντομότερο, θα σας βοηθήσει και για την εξέσταση </w:t>
       </w:r>
       <w:r>
         <w:rPr>
           <w:b w:val="false"/>
           <w:bCs w:val="false"/>
         </w:rPr>
-        <w:t>την εξέσταση σ</w:t>
+        <w:t xml:space="preserve">για </w:t>
       </w:r>
       <w:r>
         <w:rPr>
@@ -833,35 +935,61 @@
           <w:b/>
           <w:bCs/>
         </w:rPr>
-        <w:t xml:space="preserve">Τελική προθεσμία υποβολής των εργασιών: Κυριακή </w:t>
+        <w:t xml:space="preserve">Τελική προθεσμία υποβολής των εργασιών: </w:t>
       </w:r>
       <w:r>
         <w:rPr>
           <w:b/>
           <w:bCs/>
         </w:rPr>
-        <w:t>30</w:t>
-      </w:r>
-      <w:r>
-        <w:rPr>
+        <w:t>τελευτα</w:t>
+      </w:r>
+      <w:r>
+        <w:rPr>
+          <w:rFonts w:eastAsia="" w:cs="" w:cstheme="majorBidi" w:eastAsiaTheme="majorEastAsia"/>
           <w:b/>
           <w:bCs/>
-        </w:rPr>
-        <w:t xml:space="preserve"> Ιου</w:t>
+          <w:color w:val="2F5496" w:themeColor="accent1" w:themeShade="bf"/>
+          <w:kern w:val="0"/>
+          <w:sz w:val="26"/>
+          <w:szCs w:val="26"/>
+          <w:lang w:val="el-GR" w:eastAsia="en-US" w:bidi="ar-SA"/>
+        </w:rPr>
+        <w:t>ίο 10ήμερο</w:t>
       </w:r>
       <w:r>
         <w:rPr>
           <w:b/>
           <w:bCs/>
         </w:rPr>
-        <w:t>ν</w:t>
+        <w:t xml:space="preserve"> Ιουνίου, </w:t>
       </w:r>
       <w:r>
         <w:rPr>
           <w:b/>
           <w:bCs/>
         </w:rPr>
-        <w:t>ίου, ώρα 23:45.</w:t>
+        <w:t xml:space="preserve">πριν την </w:t>
+      </w:r>
+      <w:r>
+        <w:rPr>
+          <w:rFonts w:eastAsia="" w:cs="" w:cstheme="majorBidi" w:eastAsiaTheme="majorEastAsia"/>
+          <w:b/>
+          <w:bCs/>
+          <w:color w:val="2F5496" w:themeColor="accent1" w:themeShade="bf"/>
+          <w:kern w:val="0"/>
+          <w:sz w:val="26"/>
+          <w:szCs w:val="26"/>
+          <w:lang w:val="el-GR" w:eastAsia="en-US" w:bidi="ar-SA"/>
+        </w:rPr>
+        <w:t xml:space="preserve">έναρξη της εξεταστικής, </w:t>
+      </w:r>
+      <w:r>
+        <w:rPr>
+          <w:b/>
+          <w:bCs/>
+        </w:rPr>
+        <w:t>ώρα 23:45.</w:t>
       </w:r>
     </w:p>
     <w:p>
@@ -872,15 +1000,6 @@
       </w:pPr>
       <w:r>
         <w:rPr/>
-        <w:t xml:space="preserve">Η προθεσμία υποβολής είναι απόλυτα ανελαστική, </w:t>
-      </w:r>
-      <w:r>
-        <w:rPr/>
-        <w:t>προκειμένου να διορθωνούν εγκαίρως οι εργασίες</w:t>
-      </w:r>
-      <w:r>
-        <w:rPr/>
-        <w:t>. Δεν θα δοθεί παράταση για λόγους «φόρτου εργασίας», παρά μόνο για σοβαρό προσωπικό λόγο.</w:t>
       </w:r>
     </w:p>
     <w:p>
@@ -891,11 +1010,18 @@
       </w:pPr>
       <w:r>
         <w:rPr/>
-        <w:t xml:space="preserve">Είμαι πάντα στη διάθεσή σας για οποιαδήποτε διευκρίνιση ή βοήθεια, για την εργασία, αλλά και μετά το πέρας του μαθήματος και του μεταπτυχιακού. Σας ευχαριστώ για το ενδιαφέρον, τη συμμετοχή σας </w:t>
-      </w:r>
-      <w:r>
-        <w:rPr/>
-        <w:t>και τις παρατηρήσεις σας. Χάση σε εσάς το μάθημα γίνεται καλύτερο και εγώ προσωπικά το ίδιο. Σας ευχαριστώ,</w:t>
+        <w:t>Η προθεσμία υποβολής είναι απόλυτα ανελαστική, προκειμένου να διορθωνούν εγκαίρως οι εργασίες. Δεν θα δοθεί παράταση για λόγους «φόρτου εργασίας», παρά μόνο για σοβαρό προσωπικό λόγο.</w:t>
+      </w:r>
+    </w:p>
+    <w:p>
+      <w:pPr>
+        <w:pStyle w:val="Normal"/>
+        <w:jc w:val="both"/>
+        <w:rPr/>
+      </w:pPr>
+      <w:r>
+        <w:rPr/>
+        <w:t>Είμαι πάντα στη διάθεσή σας για οποιαδήποτε διευκρίνιση ή βοήθεια, για την εργασία, αλλά και μετά το πέρας του μαθήματος και του μεταπτυχιακού. Σας ευχαριστώ για το ενδιαφέρον, τη συμμετοχή σας και τις παρατηρήσεις σας. Χάση σε εσάς το μάθημα γίνεται καλύτερο και εγώ προσωπικά το ίδιο. Σας ευχαριστώ,</w:t>
       </w:r>
     </w:p>
     <w:p>
@@ -1730,6 +1856,7 @@
     <w:qFormat/>
     <w:pPr>
       <w:widowControl/>
+      <w:suppressAutoHyphens w:val="true"/>
       <w:bidi w:val="0"/>
       <w:spacing w:lineRule="auto" w:line="259" w:before="0" w:after="160"/>
       <w:jc w:val="left"/>

</xml_diff>